<commit_message>
DE-Markenraster um Twix, KitKat, Lindt und Ritter Sport ergaenzt
Anlass ist ein Befund aus Stufe 4: Twix war mit 25,1 Prozent die
viertmeistgenannte Marke Oesterreichs und stand in keinem Raster, obwohl
Mars, Snickers und Bounty desselben Herstellers enthalten waren. Lindt,
KitKat und Ritter Sport fehlten ebenfalls.

Die neuen Exportcodes 93 bis 96 setzen die 90er-Reihe der nur in Deutschland
abgefragten Marken fort. Alle drei Raster tragen dieselben Codes, die
Reihenfolge bleibt alphabetisch mit KEINE Marke fixiert am Ende, die
erweiterte Randomisierung umfasst jetzt 24 statt 20 Marken. Die Darstellung
bleibt bei drei Spalten; 25 Optionen fuellen sie mit 9, 8 und 8, KEINE Marke
steht weiterhin unten rechts.

Fuer den Laendervergleich ist das nicht folgenlos: Kennwerte je Marke bleiben
vergleichbar, Anteile am Relevant Set nicht. Im Codebuch festgehalten.

Co-Authored-By: Claude Opus 5 <noreply@anthropic.com>
Claude-Session: https://claude.ai/code/session_01Ea1G2EV9dEwvTz8t52fyCd
</commit_message>
<xml_diff>
--- a/NEOH_DE_Sep2026.docx
+++ b/NEOH_DE_Sep2026.docx
@@ -1214,6 +1214,15 @@
         <w:ind w:left="240"/>
       </w:pPr>
       <w:r>
+        <w:t xml:space="preserve">KitKat  (94)</w:t>
+      </w:r>
+    </w:p>
+    <w:p>
+      <w:pPr>
+        <w:spacing w:after="20" w:before="0"/>
+        <w:ind w:left="240"/>
+      </w:pPr>
+      <w:r>
         <w:t xml:space="preserve">Knoppers  (9)</w:t>
       </w:r>
     </w:p>
@@ -1223,6 +1232,15 @@
         <w:ind w:left="240"/>
       </w:pPr>
       <w:r>
+        <w:t xml:space="preserve">Lindt  (95)</w:t>
+      </w:r>
+    </w:p>
+    <w:p>
+      <w:pPr>
+        <w:spacing w:after="20" w:before="0"/>
+        <w:ind w:left="240"/>
+      </w:pPr>
+      <w:r>
         <w:t xml:space="preserve">Manner  (10)</w:t>
       </w:r>
     </w:p>
@@ -1295,6 +1313,15 @@
         <w:ind w:left="240"/>
       </w:pPr>
       <w:r>
+        <w:t xml:space="preserve">Ritter Sport  (96)</w:t>
+      </w:r>
+    </w:p>
+    <w:p>
+      <w:pPr>
+        <w:spacing w:after="20" w:before="0"/>
+        <w:ind w:left="240"/>
+      </w:pPr>
+      <w:r>
         <w:t xml:space="preserve">Snickers  (17)</w:t>
       </w:r>
     </w:p>
@@ -1304,6 +1331,15 @@
         <w:ind w:left="240"/>
       </w:pPr>
       <w:r>
+        <w:t xml:space="preserve">Twix  (93)</w:t>
+      </w:r>
+    </w:p>
+    <w:p>
+      <w:pPr>
+        <w:spacing w:after="20" w:before="0"/>
+        <w:ind w:left="240"/>
+      </w:pPr>
+      <w:r>
         <w:t xml:space="preserve">Xucker  (91)</w:t>
       </w:r>
     </w:p>
@@ -1428,6 +1464,15 @@
         <w:ind w:left="240"/>
       </w:pPr>
       <w:r>
+        <w:t xml:space="preserve">KitKat  (94)</w:t>
+      </w:r>
+    </w:p>
+    <w:p>
+      <w:pPr>
+        <w:spacing w:after="20" w:before="0"/>
+        <w:ind w:left="240"/>
+      </w:pPr>
+      <w:r>
         <w:t xml:space="preserve">Knoppers  (9)</w:t>
       </w:r>
     </w:p>
@@ -1437,6 +1482,15 @@
         <w:ind w:left="240"/>
       </w:pPr>
       <w:r>
+        <w:t xml:space="preserve">Lindt  (95)</w:t>
+      </w:r>
+    </w:p>
+    <w:p>
+      <w:pPr>
+        <w:spacing w:after="20" w:before="0"/>
+        <w:ind w:left="240"/>
+      </w:pPr>
+      <w:r>
         <w:t xml:space="preserve">Manner  (10)</w:t>
       </w:r>
     </w:p>
@@ -1509,6 +1563,15 @@
         <w:ind w:left="240"/>
       </w:pPr>
       <w:r>
+        <w:t xml:space="preserve">Ritter Sport  (96)</w:t>
+      </w:r>
+    </w:p>
+    <w:p>
+      <w:pPr>
+        <w:spacing w:after="20" w:before="0"/>
+        <w:ind w:left="240"/>
+      </w:pPr>
+      <w:r>
         <w:t xml:space="preserve">Snickers  (17)</w:t>
       </w:r>
     </w:p>
@@ -1518,6 +1581,15 @@
         <w:ind w:left="240"/>
       </w:pPr>
       <w:r>
+        <w:t xml:space="preserve">Twix  (93)</w:t>
+      </w:r>
+    </w:p>
+    <w:p>
+      <w:pPr>
+        <w:spacing w:after="20" w:before="0"/>
+        <w:ind w:left="240"/>
+      </w:pPr>
+      <w:r>
         <w:t xml:space="preserve">Xucker  (91)</w:t>
       </w:r>
     </w:p>
@@ -1642,6 +1714,15 @@
         <w:ind w:left="240"/>
       </w:pPr>
       <w:r>
+        <w:t xml:space="preserve">KitKat  (94)</w:t>
+      </w:r>
+    </w:p>
+    <w:p>
+      <w:pPr>
+        <w:spacing w:after="20" w:before="0"/>
+        <w:ind w:left="240"/>
+      </w:pPr>
+      <w:r>
         <w:t xml:space="preserve">Knoppers  (9)</w:t>
       </w:r>
     </w:p>
@@ -1651,6 +1732,15 @@
         <w:ind w:left="240"/>
       </w:pPr>
       <w:r>
+        <w:t xml:space="preserve">Lindt  (95)</w:t>
+      </w:r>
+    </w:p>
+    <w:p>
+      <w:pPr>
+        <w:spacing w:after="20" w:before="0"/>
+        <w:ind w:left="240"/>
+      </w:pPr>
+      <w:r>
         <w:t xml:space="preserve">Manner  (10)</w:t>
       </w:r>
     </w:p>
@@ -1723,7 +1813,25 @@
         <w:ind w:left="240"/>
       </w:pPr>
       <w:r>
+        <w:t xml:space="preserve">Ritter Sport  (96)</w:t>
+      </w:r>
+    </w:p>
+    <w:p>
+      <w:pPr>
+        <w:spacing w:after="20" w:before="0"/>
+        <w:ind w:left="240"/>
+      </w:pPr>
+      <w:r>
         <w:t xml:space="preserve">Snickers  (17)</w:t>
+      </w:r>
+    </w:p>
+    <w:p>
+      <w:pPr>
+        <w:spacing w:after="20" w:before="0"/>
+        <w:ind w:left="240"/>
+      </w:pPr>
+      <w:r>
+        <w:t xml:space="preserve">Twix  (93)</w:t>
       </w:r>
     </w:p>
     <w:p>

</xml_diff>